<commit_message>
Paper: cite Davis 2024 (cm4c01978) as the Tier-A/C data source
Citation verification of Table A.1 against the committed data source-codes:
- cm4c01978_si_001 = Davis, Marrs, Cawkwell & Manner 2024 (Chem. Mater.), the
  dominant Tier-A crystallographic-density source (12,040 rows) and Tier-C K-J
  data source (35,965). It was cited in neither row; added ref [71] to both and
  corrected the Tier-A description (it read "hand-compilation" while counting
  ~19,200).
- Flagged for author: Tier-B cites [15] Casey 2020, but the actual source is the
  EMDP dataset (github.com/ming1219/EMDP); Casey 2020 is a 3D-CNN electronic-
  structure paper. See paper/DATA_AUDIT_tier_funnel.md for the full table.

Co-Authored-By: Claude Opus 4.8 <noreply@anthropic.com>
</commit_message>
<xml_diff>
--- a/paper/molecules/molecules_paper_SI.docx
+++ b/paper/molecules/molecules_paper_SI.docx
@@ -431,7 +431,7 @@
                 <w:sz w:val="18"/>
                 <w:szCs w:val="18"/>
               </w:rPr>
-              <w:t xml:space="preserve">Hand-compilation of experimental</w:t>
+              <w:t xml:space="preserve">Experimental crystallographic densities (Davis et al. 2024, cm4c01978 SI) plus measured</w:t>
             </w:r>
             <w:r>
               <w:rPr>
@@ -507,7 +507,7 @@
                 <w:sz w:val="18"/>
                 <w:szCs w:val="18"/>
               </w:rPr>
-              <w:t xml:space="preserve">for known nitro / nitramine / azide / tetrazole compounds, drawn from Klapötke (2019), Cooper (1996), and the LLNL Explosives Handbook (Dobratz &amp; Crawford 1985)</w:t>
+              <w:t xml:space="preserve">hand-compiled from Klapötke (2019), Cooper (1996), and the LLNL Explosives Handbook (Dobratz &amp; Crawford 1985)</w:t>
             </w:r>
           </w:p>
         </w:tc>
@@ -567,6 +567,30 @@
                   <w:szCs w:val="18"/>
                 </w:rPr>
                 <w:t xml:space="preserve">[60]</w:t>
+              </w:r>
+            </w:hyperlink>
+            <w:r>
+              <w:rPr>
+                <w:sz w:val="18"/>
+                <w:szCs w:val="18"/>
+              </w:rPr>
+              <w:t xml:space="preserve">,</w:t>
+            </w:r>
+            <w:r>
+              <w:rPr>
+                <w:sz w:val="18"/>
+                <w:szCs w:val="18"/>
+              </w:rPr>
+              <w:t xml:space="preserve"> </w:t>
+            </w:r>
+            <w:hyperlink w:anchor="ref-mlcrystdens-cm-2024">
+              <w:r>
+                <w:rPr>
+                  <w:rStyle w:val="Hyperlink"/>
+                  <w:sz w:val="18"/>
+                  <w:szCs w:val="18"/>
+                </w:rPr>
+                <w:t xml:space="preserve">[71]</w:t>
               </w:r>
             </w:hyperlink>
           </w:p>
@@ -795,6 +819,20 @@
                 <m:t>P</m:t>
               </m:r>
             </m:oMath>
+            <w:r>
+              <w:rPr>
+                <w:sz w:val="18"/>
+                <w:szCs w:val="18"/>
+              </w:rPr>
+              <w:t xml:space="preserve"> </w:t>
+            </w:r>
+            <w:r>
+              <w:rPr>
+                <w:sz w:val="18"/>
+                <w:szCs w:val="18"/>
+              </w:rPr>
+              <w:t xml:space="preserve">(densities and HOF from Davis et al. 2024, cm4c01978 SI)</w:t>
+            </w:r>
           </w:p>
         </w:tc>
         <w:tc>
@@ -853,6 +891,30 @@
                   <w:szCs w:val="18"/>
                 </w:rPr>
                 <w:t xml:space="preserve">[62]</w:t>
+              </w:r>
+            </w:hyperlink>
+            <w:r>
+              <w:rPr>
+                <w:sz w:val="18"/>
+                <w:szCs w:val="18"/>
+              </w:rPr>
+              <w:t xml:space="preserve">,</w:t>
+            </w:r>
+            <w:r>
+              <w:rPr>
+                <w:sz w:val="18"/>
+                <w:szCs w:val="18"/>
+              </w:rPr>
+              <w:t xml:space="preserve"> </w:t>
+            </w:r>
+            <w:hyperlink w:anchor="ref-mlcrystdens-cm-2024">
+              <w:r>
+                <w:rPr>
+                  <w:rStyle w:val="Hyperlink"/>
+                  <w:sz w:val="18"/>
+                  <w:szCs w:val="18"/>
+                </w:rPr>
+                <w:t xml:space="preserve">[71]</w:t>
               </w:r>
             </w:hyperlink>
           </w:p>

</xml_diff>

<commit_message>
Paper: reassign Tier-B citation (Casey 2020 -> Liu 2025/EMDP); mirror to NMI SI
Verification established the Tier-B source is the EMDP de-novo dataset
(github.com/ming1219/EMDP), not Casey 2020 (a 3D-CNN electronic-structure
paper). Reassign:
- Tier-B -> Liu 2025 (ref-npjcompmat2025), the EMDP dataset's publication.
- Casey 2020 moved to Tier-D as the 3D-CNN methodology reference.
- NMI SI reference list extended with Davis 2024 [17] and Liu 2025 [18]; the
  same Tier-A/C (Davis) and Tier-B (Liu) / Tier-D (Casey) assignments mirrored.

Pre-existing bibliography-numbering inconsistency (displayed numbers vs list
order in long_paper.html) noted in DATA_AUDIT_tier_funnel.md for a later
normalization pass; href anchors are correct.

Co-Authored-By: Claude Opus 4.8 <noreply@anthropic.com>
</commit_message>
<xml_diff>
--- a/paper/molecules/molecules_paper_SI.docx
+++ b/paper/molecules/molecules_paper_SI.docx
@@ -270,11 +270,11 @@
         <w:tblLook w:val="0420" w:firstRow="1" w:lastRow="0" w:firstColumn="0" w:lastColumn="0" w:noHBand="0" w:noVBand="1"/>
       </w:tblPr>
       <w:tblGrid>
-        <w:gridCol w:w="1246"/>
-        <w:gridCol w:w="3355"/>
-        <w:gridCol w:w="1187"/>
-        <w:gridCol w:w="1160"/>
-        <w:gridCol w:w="910"/>
+        <w:gridCol w:w="1173"/>
+        <w:gridCol w:w="2831"/>
+        <w:gridCol w:w="1135"/>
+        <w:gridCol w:w="1082"/>
+        <w:gridCol w:w="1637"/>
       </w:tblGrid>
       <w:tr>
         <w:trPr>
@@ -736,14 +736,14 @@
               <w:suppressAutoHyphens/>
               <w:jc w:val="center"/>
             </w:pPr>
-            <w:hyperlink w:anchor="ref-casey2020prediction">
+            <w:hyperlink w:anchor="ref-npjcompmat2025">
               <w:r>
                 <w:rPr>
                   <w:rStyle w:val="Hyperlink"/>
                   <w:sz w:val="18"/>
                   <w:szCs w:val="18"/>
                 </w:rPr>
-                <w:t xml:space="preserve">[15]</w:t>
+                <w:t xml:space="preserve">[npjcompmat2025]</w:t>
               </w:r>
             </w:hyperlink>
           </w:p>
@@ -1083,8 +1083,25 @@
                 <w:sz w:val="18"/>
                 <w:szCs w:val="18"/>
               </w:rPr>
-              <w:t xml:space="preserve">this work</w:t>
-            </w:r>
+              <w:t xml:space="preserve">this work,</w:t>
+            </w:r>
+            <w:r>
+              <w:rPr>
+                <w:sz w:val="18"/>
+                <w:szCs w:val="18"/>
+              </w:rPr>
+              <w:t xml:space="preserve"> </w:t>
+            </w:r>
+            <w:hyperlink w:anchor="ref-casey2020prediction">
+              <w:r>
+                <w:rPr>
+                  <w:rStyle w:val="Hyperlink"/>
+                  <w:sz w:val="18"/>
+                  <w:szCs w:val="18"/>
+                </w:rPr>
+                <w:t xml:space="preserve">[15]</w:t>
+              </w:r>
+            </w:hyperlink>
           </w:p>
         </w:tc>
       </w:tr>

</xml_diff>

<commit_message>
Paper: SI table-letter ordering (cosmetic)
- Swapped the C.1b/C.1c labels so the four per-lead/reference-class DFT tables
  read in alphabetical physical order (C.1, C.1b, C.1c, C.1d); atomic swap keeps
  every caption cross-link and in-text reference consistent (0 dangling).
- The build-added CFG-scale table (previously "Table D.7", appearing physically
  4th, before D.4-D.6) is now "Table D.3a", giving a sequential D-table run
  D.1, D.2, D.3, D.3a, D.4, D.4b, D.5, D.6. It had no numbered references.
All long + Molecules docx rebuilt.

Co-Authored-By: Claude Opus 4.8 <noreply@anthropic.com>
</commit_message>
<xml_diff>
--- a/paper/molecules/molecules_paper_SI.docx
+++ b/paper/molecules/molecules_paper_SI.docx
@@ -9533,7 +9533,7 @@
         <w:t xml:space="preserve"> </w:t>
       </w:r>
       <w:r>
-        <w:t xml:space="preserve">predictions are in Table C.1c.</w:t>
+        <w:t xml:space="preserve">predictions are in Table C.1b.</w:t>
       </w:r>
     </w:p>
     <w:tbl>
@@ -12146,7 +12146,7 @@
           <w:b/>
           <w:bCs/>
         </w:rPr>
-        <w:t xml:space="preserve">Table C.1c.</w:t>
+        <w:t xml:space="preserve">Table C.1b.</w:t>
       </w:r>
       <w:r>
         <w:t xml:space="preserve"> </w:t>
@@ -14777,7 +14777,7 @@
           <w:b/>
           <w:bCs/>
         </w:rPr>
-        <w:t xml:space="preserve">Table C.1b.</w:t>
+        <w:t xml:space="preserve">Table C.1c.</w:t>
       </w:r>
       <w:r>
         <w:t xml:space="preserve"> </w:t>
@@ -15514,7 +15514,7 @@
         <w:t xml:space="preserve"> </w:t>
       </w:r>
       <w:r>
-        <w:t xml:space="preserve">DFT-derived properties for the three reference-class scaffolds. Calibration as Table C.1c. h</w:t>
+        <w:t xml:space="preserve">DFT-derived properties for the three reference-class scaffolds. Calibration as Table C.1b. h</w:t>
       </w:r>
       <w:r>
         <w:rPr>
@@ -16447,7 +16447,7 @@
         </m:r>
       </m:oMath>
       <w:r>
-        <w:t xml:space="preserve">B97X-D3BJ DFT outputs are tabulated in Table C.1c. The 6-anchor regression gives</w:t>
+        <w:t xml:space="preserve">B97X-D3BJ DFT outputs are tabulated in Table C.1b. The 6-anchor regression gives</w:t>
       </w:r>
       <w:r>
         <w:t xml:space="preserve"> </w:t>
@@ -26285,7 +26285,7 @@
           <w:b/>
           <w:bCs/>
         </w:rPr>
-        <w:t xml:space="preserve">Table D.7.</w:t>
+        <w:t xml:space="preserve">Table D.3a.</w:t>
       </w:r>
       <w:r>
         <w:t xml:space="preserve"> </w:t>

</xml_diff>